<commit_message>
Quality of life changes
-Fixed error that occurs if copy/pasting sequence from powerpoint to website
-Fixed text runoff when pasting a long sequence
-Drag bar starts at 0 degrees, can rotate in both directions
-Added text box to typed in angle of degree rotation
-When saving the svg/png, you have the option to type in the file name
-Added a reset custom settings to default button
</commit_message>
<xml_diff>
--- a/AptaRender_Tutorial.docx
+++ b/AptaRender_Tutorial.docx
@@ -1122,6 +1122,88 @@
                 <w:b/>
                 <w:bCs/>
               </w:rPr>
+              <w:t xml:space="preserve">Reset to default</w:t>
+            </w:r>
+            <w:r>
+              <w:t xml:space="preserve"> (next to Undo/Redo)</w:t>
+            </w:r>
+          </w:p>
+        </w:tc>
+        <w:tc>
+          <w:tcPr>
+            <w:tcW w:type="dxa" w:w="6660"/>
+            <w:tcBorders>
+              <w:top w:val="single" w:color="D3D8DF" w:sz="4"/>
+              <w:left w:val="single" w:color="D3D8DF" w:sz="4"/>
+              <w:bottom w:val="single" w:color="D3D8DF" w:sz="4"/>
+              <w:right w:val="single" w:color="D3D8DF" w:sz="4"/>
+            </w:tcBorders>
+            <w:tcMar>
+              <w:top w:type="dxa" w:w="70"/>
+              <w:left w:type="dxa" w:w="110"/>
+              <w:bottom w:type="dxa" w:w="70"/>
+              <w:right w:type="dxa" w:w="110"/>
+            </w:tcMar>
+          </w:tcPr>
+          <w:p>
+            <w:pPr>
+              <w:spacing w:after="40"/>
+            </w:pPr>
+            <w:r>
+              <w:t xml:space="preserve">Puts what's open back to a fresh render: manual positions, letter colors (back to the palette), circle fills, bond colors, base sizes and rotation are cleared, and every style setting (font, circles, lines, numbering, tail style, background) returns to its default. With </w:t>
+            </w:r>
+            <w:r>
+              <w:rPr>
+                <w:b/>
+                <w:bCs/>
+              </w:rPr>
+              <w:t xml:space="preserve">Uniform style</w:t>
+            </w:r>
+            <w:r>
+              <w:t xml:space="preserve"> on, the style part applies to all sequences. One </w:t>
+            </w:r>
+            <w:r>
+              <w:rPr>
+                <w:b/>
+                <w:bCs/>
+              </w:rPr>
+              <w:t xml:space="preserve">Undo</w:t>
+            </w:r>
+            <w:r>
+              <w:t xml:space="preserve"> brings everything back.</w:t>
+            </w:r>
+          </w:p>
+        </w:tc>
+      </w:tr>
+      <w:tr>
+        <w:trPr>
+          <w:cantSplit/>
+        </w:trPr>
+        <w:tc>
+          <w:tcPr>
+            <w:tcW w:type="dxa" w:w="2700"/>
+            <w:tcBorders>
+              <w:top w:val="single" w:color="D3D8DF" w:sz="4"/>
+              <w:left w:val="single" w:color="D3D8DF" w:sz="4"/>
+              <w:bottom w:val="single" w:color="D3D8DF" w:sz="4"/>
+              <w:right w:val="single" w:color="D3D8DF" w:sz="4"/>
+            </w:tcBorders>
+            <w:tcMar>
+              <w:top w:type="dxa" w:w="70"/>
+              <w:left w:type="dxa" w:w="110"/>
+              <w:bottom w:type="dxa" w:w="70"/>
+              <w:right w:type="dxa" w:w="110"/>
+            </w:tcMar>
+          </w:tcPr>
+          <w:p>
+            <w:pPr>
+              <w:spacing w:after="40"/>
+            </w:pPr>
+            <w:r>
+              <w:rPr>
+                <w:b/>
+                <w:bCs/>
+              </w:rPr>
               <w:t xml:space="preserve">Badge</w:t>
             </w:r>
             <w:r>
@@ -1899,6 +1981,27 @@
     </w:p>
     <w:p>
       <w:pPr>
+        <w:pBdr>
+          <w:left w:val="single" w:color="2F5D8A" w:sz="24" w:space="8"/>
+        </w:pBdr>
+        <w:shd w:fill="EEF4FA" w:color="auto" w:val="clear"/>
+        <w:spacing w:after="160" w:before="120"/>
+        <w:ind w:left="160" w:right="160"/>
+      </w:pPr>
+      <w:r>
+        <w:rPr>
+          <w:b/>
+          <w:bCs/>
+          <w:color w:val="2F5D8A"/>
+        </w:rPr>
+        <w:t xml:space="preserve">Tip  </w:t>
+      </w:r>
+      <w:r>
+        <w:t xml:space="preserve">Copying from PowerPoint, Word, PDFs or web pages is fine. Hidden characters they add (zero-width spaces, soft hyphens, non-breaking spaces, line separators) are removed automatically, an autocorrected "…" is read as three dots, and full-width brackets are read as normal ones.</w:t>
+      </w:r>
+    </w:p>
+    <w:p>
+      <w:pPr>
         <w:pStyle w:val="Heading3"/>
       </w:pPr>
       <w:r>
@@ -2093,7 +2196,7 @@
               <w:spacing w:after="40"/>
             </w:pPr>
             <w:r>
-              <w:t xml:space="preserve">Only A U T G C N are allowed in the sequence.</w:t>
+              <w:t xml:space="preserve">Only A U T G C N are allowed in the sequence. The message gives the position, and names the character by its code (e.g. U+00A9) if it's hard to see.</w:t>
             </w:r>
           </w:p>
         </w:tc>
@@ -3176,7 +3279,7 @@
               <w:spacing w:after="40"/>
             </w:pPr>
             <w:r>
-              <w:t xml:space="preserve">The sequence for the open slot. Saved as you type.</w:t>
+              <w:t xml:space="preserve">The sequence for the open slot. Saved as you type. Long sequences wrap onto the next line.</w:t>
             </w:r>
           </w:p>
         </w:tc>
@@ -3210,7 +3313,7 @@
                 <w:b/>
                 <w:bCs/>
               </w:rPr>
-              <w:t xml:space="preserve">Dot-bracket structure</w:t>
+              <w:t xml:space="preserve">Structure</w:t>
             </w:r>
             <w:r>
               <w:t xml:space="preserve"> box</w:t>
@@ -3238,7 +3341,7 @@
               <w:spacing w:after="40"/>
             </w:pPr>
             <w:r>
-              <w:t xml:space="preserve">The structure for the open slot (see section 3).</w:t>
+              <w:t xml:space="preserve">The dot-bracket structure for the open slot (see section 3). It wraps at the same column as the Sequence box, so each structure character sits under its base.</w:t>
             </w:r>
           </w:p>
         </w:tc>
@@ -3297,7 +3400,7 @@
               <w:spacing w:after="40"/>
             </w:pPr>
             <w:r>
-              <w:t xml:space="preserve">Draws the structure from the two boxes and fits it to the view.</w:t>
+              <w:t xml:space="preserve">Draws the structure from the two boxes, sets the rotation to 0° and fits it to the view.</w:t>
             </w:r>
           </w:p>
         </w:tc>
@@ -3456,7 +3559,7 @@
         <w:t xml:space="preserve">Render</w:t>
       </w:r>
       <w:r>
-        <w:t xml:space="preserve"> starts that sequence fresh: custom letter and circle colors, bond colors and dragged positions are reset. If you only meant to restyle, use the other tabs instead. If you clicked it by accident, press </w:t>
+        <w:t xml:space="preserve"> starts that sequence fresh: custom letter and circle colors, bond colors, base sizes, dragged positions and rotation are reset. If you only meant to restyle, use the other tabs instead. If you clicked it by accident, press </w:t>
       </w:r>
       <w:r>
         <w:rPr>
@@ -3668,7 +3771,7 @@
               <w:t xml:space="preserve">Rotate structure</w:t>
             </w:r>
             <w:r>
-              <w:t xml:space="preserve"> slider</w:t>
+              <w:t xml:space="preserve"> slider + angle box</w:t>
             </w:r>
           </w:p>
         </w:tc>
@@ -3693,7 +3796,7 @@
               <w:spacing w:after="40"/>
             </w:pPr>
             <w:r>
-              <w:t xml:space="preserve">Turns the whole drawing 0–360°. Letters always stay upright.</w:t>
+              <w:t xml:space="preserve">Turns the whole drawing up to a full turn either way: −360° to 360°, with 0 in the middle. Positive is clockwise, negative counter-clockwise. Drag the slider, or type an exact angle in the box next to it (decimals are fine) and press Enter; the slider moves to exactly what you typed. The two always stay in sync. Letters always stay upright.</w:t>
             </w:r>
           </w:p>
         </w:tc>
@@ -8127,6 +8230,124 @@
                 <w:b/>
                 <w:bCs/>
               </w:rPr>
+              <w:t xml:space="preserve">File name</w:t>
+            </w:r>
+          </w:p>
+        </w:tc>
+        <w:tc>
+          <w:tcPr>
+            <w:tcW w:type="dxa" w:w="6660"/>
+            <w:tcBorders>
+              <w:top w:val="single" w:color="D3D8DF" w:sz="4"/>
+              <w:left w:val="single" w:color="D3D8DF" w:sz="4"/>
+              <w:bottom w:val="single" w:color="D3D8DF" w:sz="4"/>
+              <w:right w:val="single" w:color="D3D8DF" w:sz="4"/>
+            </w:tcBorders>
+            <w:tcMar>
+              <w:top w:type="dxa" w:w="70"/>
+              <w:left w:type="dxa" w:w="110"/>
+              <w:bottom w:type="dxa" w:w="70"/>
+              <w:right w:type="dxa" w:w="110"/>
+            </w:tcMar>
+          </w:tcPr>
+          <w:p>
+            <w:pPr>
+              <w:spacing w:after="40"/>
+            </w:pPr>
+            <w:r>
+              <w:t xml:space="preserve">Name for the downloaded file. Leave it blank to use the sequence's (or complex's) name; .svg or .png is added for you, and characters file systems don't allow are replaced.</w:t>
+            </w:r>
+          </w:p>
+        </w:tc>
+      </w:tr>
+      <w:tr>
+        <w:trPr>
+          <w:cantSplit/>
+        </w:trPr>
+        <w:tc>
+          <w:tcPr>
+            <w:tcW w:type="dxa" w:w="2700"/>
+            <w:tcBorders>
+              <w:top w:val="single" w:color="D3D8DF" w:sz="4"/>
+              <w:left w:val="single" w:color="D3D8DF" w:sz="4"/>
+              <w:bottom w:val="single" w:color="D3D8DF" w:sz="4"/>
+              <w:right w:val="single" w:color="D3D8DF" w:sz="4"/>
+            </w:tcBorders>
+            <w:tcMar>
+              <w:top w:type="dxa" w:w="70"/>
+              <w:left w:type="dxa" w:w="110"/>
+              <w:bottom w:type="dxa" w:w="70"/>
+              <w:right w:type="dxa" w:w="110"/>
+            </w:tcMar>
+          </w:tcPr>
+          <w:p>
+            <w:pPr>
+              <w:spacing w:after="40"/>
+            </w:pPr>
+            <w:r>
+              <w:rPr>
+                <w:b/>
+                <w:bCs/>
+              </w:rPr>
+              <w:t xml:space="preserve">Open a Save dialog</w:t>
+            </w:r>
+          </w:p>
+        </w:tc>
+        <w:tc>
+          <w:tcPr>
+            <w:tcW w:type="dxa" w:w="6660"/>
+            <w:tcBorders>
+              <w:top w:val="single" w:color="D3D8DF" w:sz="4"/>
+              <w:left w:val="single" w:color="D3D8DF" w:sz="4"/>
+              <w:bottom w:val="single" w:color="D3D8DF" w:sz="4"/>
+              <w:right w:val="single" w:color="D3D8DF" w:sz="4"/>
+            </w:tcBorders>
+            <w:tcMar>
+              <w:top w:type="dxa" w:w="70"/>
+              <w:left w:type="dxa" w:w="110"/>
+              <w:bottom w:type="dxa" w:w="70"/>
+              <w:right w:type="dxa" w:w="110"/>
+            </w:tcMar>
+          </w:tcPr>
+          <w:p>
+            <w:pPr>
+              <w:spacing w:after="40"/>
+            </w:pPr>
+            <w:r>
+              <w:t xml:space="preserve">In Chrome and Edge, opens the system Save dialog for each export so you can rename the file and choose the folder. Not available in Safari or Firefox; in Safari, turn on Settings → General → File download location → Ask for each download to get the same effect.</w:t>
+            </w:r>
+          </w:p>
+        </w:tc>
+      </w:tr>
+      <w:tr>
+        <w:trPr>
+          <w:cantSplit/>
+        </w:trPr>
+        <w:tc>
+          <w:tcPr>
+            <w:tcW w:type="dxa" w:w="2700"/>
+            <w:tcBorders>
+              <w:top w:val="single" w:color="D3D8DF" w:sz="4"/>
+              <w:left w:val="single" w:color="D3D8DF" w:sz="4"/>
+              <w:bottom w:val="single" w:color="D3D8DF" w:sz="4"/>
+              <w:right w:val="single" w:color="D3D8DF" w:sz="4"/>
+            </w:tcBorders>
+            <w:tcMar>
+              <w:top w:type="dxa" w:w="70"/>
+              <w:left w:type="dxa" w:w="110"/>
+              <w:bottom w:type="dxa" w:w="70"/>
+              <w:right w:type="dxa" w:w="110"/>
+            </w:tcMar>
+          </w:tcPr>
+          <w:p>
+            <w:pPr>
+              <w:spacing w:after="40"/>
+            </w:pPr>
+            <w:r>
+              <w:rPr>
+                <w:b/>
+                <w:bCs/>
+              </w:rPr>
               <w:t xml:space="preserve">SVG</w:t>
             </w:r>
           </w:p>
@@ -8152,7 +8373,7 @@
               <w:spacing w:after="40"/>
             </w:pPr>
             <w:r>
-              <w:t xml:space="preserve">Downloads aptarender.svg: fully editable vector art (every letter is its own text element) for Illustrator, Inkscape or Affinity.</w:t>
+              <w:t xml:space="preserve">Downloads an .svg file: fully editable vector art (every letter is its own text element) for Illustrator, Inkscape or Affinity.</w:t>
             </w:r>
           </w:p>
         </w:tc>
@@ -8211,7 +8432,7 @@
               <w:spacing w:after="40"/>
             </w:pPr>
             <w:r>
-              <w:t xml:space="preserve">Downloads aptarender.png at the chosen scale.</w:t>
+              <w:t xml:space="preserve">Downloads a .png file at the chosen scale.</w:t>
             </w:r>
           </w:p>
         </w:tc>
@@ -11355,6 +11576,16 @@
                 <w:bCs/>
               </w:rPr>
               <w:t xml:space="preserve">Render</w:t>
+            </w:r>
+            <w:r>
+              <w:t xml:space="preserve">, </w:t>
+            </w:r>
+            <w:r>
+              <w:rPr>
+                <w:b/>
+                <w:bCs/>
+              </w:rPr>
+              <w:t xml:space="preserve">Reset to default</w:t>
             </w:r>
             <w:r>
               <w:t xml:space="preserve">, </w:t>

</xml_diff>